<commit_message>
fix: close final stage1 audit gaps
</commit_message>
<xml_diff>
--- a/Literature/notes/expose/expose_final_19jun.docx
+++ b/Literature/notes/expose/expose_final_19jun.docx
@@ -2,6 +2,29 @@
 <file path=word/document.xml><?xml version="1.0" encoding="utf-8"?>
 <w:document xmlns:wpc="http://schemas.microsoft.com/office/word/2010/wordprocessingCanvas" xmlns:mo="http://schemas.microsoft.com/office/mac/office/2008/main" xmlns:mc="http://schemas.openxmlformats.org/markup-compatibility/2006" xmlns:mv="urn:schemas-microsoft-com:mac:vml" xmlns:o="urn:schemas-microsoft-com:office:office" xmlns:r="http://schemas.openxmlformats.org/officeDocument/2006/relationships" xmlns:m="http://schemas.openxmlformats.org/officeDocument/2006/math" xmlns:v="urn:schemas-microsoft-com:vml" xmlns:wp14="http://schemas.microsoft.com/office/word/2010/wordprocessingDrawing" xmlns:wp="http://schemas.openxmlformats.org/drawingml/2006/wordprocessingDrawing" xmlns:w10="urn:schemas-microsoft-com:office:word" xmlns:w="http://schemas.openxmlformats.org/wordprocessingml/2006/main" xmlns:w14="http://schemas.microsoft.com/office/word/2010/wordml" xmlns:wpg="http://schemas.microsoft.com/office/word/2010/wordprocessingGroup" xmlns:wpi="http://schemas.microsoft.com/office/word/2010/wordprocessingInk" xmlns:wne="http://schemas.microsoft.com/office/word/2006/wordml" xmlns:wps="http://schemas.microsoft.com/office/word/2010/wordprocessingShape" mc:Ignorable="w14 wp14">
   <w:body>
+    <w:p>
+      <w:pPr>
+        <w:spacing w:before="120" w:after="200"/>
+        <w:ind w:left="142" w:right="142"/>
+        <w:shd w:fill="FDECEC"/>
+      </w:pPr>
+      <w:r>
+        <w:rPr>
+          <w:b/>
+          <w:color w:val="9C1C1C"/>
+          <w:sz w:val="20"/>
+        </w:rPr>
+        <w:t>HISTORICAL WORKING DRAFT (June 2026) — SUPERSEDED</w:t>
+        <w:br/>
+      </w:r>
+      <w:r>
+        <w:rPr>
+          <w:color w:val="6B1A1A"/>
+          <w:sz w:val="18"/>
+        </w:rPr>
+        <w:t>Retained for provenance; this is not the current methodology or claim basis. The automotive domain, post-study ML path, Cognitive Load Index, HCEye-calibration framing, screening-tool claim, and final validation strategy are superseded or remain open. See Literature/notes/expose/README.md before reuse.</w:t>
+      </w:r>
+    </w:p>
     <w:p>
       <w:pPr>
         <w:pStyle w:val="Title"/>

</xml_diff>